<commit_message>
Revisión ampliada, vuelta 1: estados viejos, letras sin formato y planillas cortadas
Textos que seguían en la etapa anterior (Árbol de docs/analisis, Bitácora,
Estimación, Modalidad, Conexionado, Parado automático), el texto alternativo
de nueve imágenes de los sitios, negritas y letras sin formato en el Estado
completo, la Guía C y D y la Estimación, filas de las planillas con texto
cortado y la Checklist, que se imprimía en 8 hojas.

Co-Authored-By: Claude Opus 5.5 <noreply@anthropic.com>
Claude-Session: https://claude.ai/code/session_01QiY8ZZNAM9gwPKiqSkCaaj
</commit_message>
<xml_diff>
--- a/documentacion_proyecto/Estado_Completo_del_Proyecto.docx
+++ b/documentacion_proyecto/Estado_Completo_del_Proyecto.docx
@@ -5321,7 +5321,15 @@
           <w:sz w:val="21"/>
           <w:szCs w:val="21"/>
         </w:rPr>
-        <w:t xml:space="preserve">Hecho el 17/10/2026, en protoboard: la alimentación del lector se midió (entre 15 y 30 V: va la resistencia de protección de 470 Ω 3 W), el sensor de pasada quedó conectado y calibrado, y el primer canal del Nivel 2 seleccionó bien. Falta anotar la corriente con la resistencia de protección.</w:t>
+        <w:t xml:space="preserve">Hecho el 17/10/2026, en protoboard: </w:t>
+      </w:r>
+      <w:r>
+        <w:rPr>
+          <w:rFonts w:ascii="IBM Plex Sans" w:cs="IBM Plex Sans" w:eastAsia="IBM Plex Sans" w:hAnsi="IBM Plex Sans"/>
+          <w:sz w:val="21"/>
+          <w:szCs w:val="21"/>
+        </w:rPr>
+        <w:t xml:space="preserve">la alimentación del lector se midió (entre 15 y 30 V: va la resistencia de protección de 470 Ω 3 W), el sensor de pasada quedó conectado y calibrado, y el primer canal del Nivel 2 seleccionó bien. Falta anotar la corriente con la resistencia de protección.</w:t>
       </w:r>
     </w:p>
     <w:p>
@@ -5341,7 +5349,15 @@
           <w:sz w:val="21"/>
           <w:szCs w:val="21"/>
         </w:rPr>
-        <w:t>Hecho el 19/09/2026: el Bloque A quedó instalado y probado en el telar.</w:t>
+        <w:t xml:space="preserve">Hecho el 19/09/2026: </w:t>
+      </w:r>
+      <w:r>
+        <w:rPr>
+          <w:rFonts w:ascii="IBM Plex Sans" w:cs="IBM Plex Sans" w:eastAsia="IBM Plex Sans" w:hAnsi="IBM Plex Sans"/>
+          <w:sz w:val="21"/>
+          <w:szCs w:val="21"/>
+        </w:rPr>
+        <w:t xml:space="preserve">el Bloque A quedó instalado y probado en el telar.</w:t>
       </w:r>
     </w:p>
     <w:p>
@@ -5389,7 +5405,15 @@
           <w:sz w:val="21"/>
           <w:szCs w:val="21"/>
         </w:rPr>
-        <w:t>Bloque C: pasar el sensor, ya conectado y calibrado, a la plaqueta y validar el conteo durante una jornada.</w:t>
+        <w:t xml:space="preserve">Bloque C: </w:t>
+      </w:r>
+      <w:r>
+        <w:rPr>
+          <w:rFonts w:ascii="IBM Plex Sans" w:cs="IBM Plex Sans" w:eastAsia="IBM Plex Sans" w:hAnsi="IBM Plex Sans"/>
+          <w:sz w:val="21"/>
+          <w:szCs w:val="21"/>
+        </w:rPr>
+        <w:t xml:space="preserve">pasar el sensor, ya conectado y calibrado, a la plaqueta y validar el conteo durante una jornada.</w:t>
       </w:r>
     </w:p>
     <w:p>

</xml_diff>